<commit_message>
Rewrite SAiMIS reports with student name and embedded figures
Reports are written as completed work (Meyer-Shishnev), no reviewer
line and no screenshot placeholders. Figures taken from model runs
and lab diagrams.

Co-authored-by: arena-agent <297053741+arena-agent@users.noreply.github.com>
</commit_message>
<xml_diff>
--- a/Отчеты/Отчет_Лр_пример_1_САиМИС.docx
+++ b/Отчеты/Отчет_Лр_пример_1_САиМИС.docx
@@ -4,24 +4,61 @@
   <w:body>
     <w:p>
       <w:pPr>
+        <w:ind w:firstLine="0"/>
         <w:jc w:val="center"/>
       </w:pPr>
       <w:r>
         <w:rPr>
+          <w:rFonts w:ascii="Times New Roman" w:hAnsi="Times New Roman" w:eastAsia="Times New Roman" w:cs="Times New Roman"/>
           <w:b w:val="0"/>
           <w:i w:val="0"/>
+          <w:color w:val="000000"/>
+          <w:sz w:val="24"/>
         </w:rPr>
-        <w:t>Дисциплина: САиМИС (системный анализ и моделирование информационных систем)</w:t>
+        <w:t>Министерство науки и высшего образования Российской Федерации</w:t>
       </w:r>
     </w:p>
     <w:p>
       <w:pPr>
+        <w:ind w:firstLine="0"/>
         <w:jc w:val="center"/>
       </w:pPr>
       <w:r>
         <w:rPr>
+          <w:rFonts w:ascii="Times New Roman" w:hAnsi="Times New Roman" w:eastAsia="Times New Roman" w:cs="Times New Roman"/>
+          <w:b w:val="0"/>
+          <w:i w:val="0"/>
+          <w:color w:val="000000"/>
+          <w:sz w:val="26"/>
+        </w:rPr>
+        <w:t>Дисциплина: системный анализ и моделирование информационных систем (САиМИС)</w:t>
+      </w:r>
+    </w:p>
+    <w:p>
+      <w:pPr>
+        <w:ind w:firstLine="0"/>
+      </w:pPr>
+      <w:r>
+        <w:rPr>
+          <w:rFonts w:ascii="Times New Roman" w:hAnsi="Times New Roman" w:eastAsia="Times New Roman" w:cs="Times New Roman"/>
+          <w:b w:val="0"/>
+          <w:i w:val="0"/>
+          <w:color w:val="000000"/>
+          <w:sz w:val="20"/>
+        </w:rPr>
+      </w:r>
+    </w:p>
+    <w:p>
+      <w:pPr>
+        <w:ind w:firstLine="0"/>
+        <w:jc w:val="center"/>
+      </w:pPr>
+      <w:r>
+        <w:rPr>
+          <w:rFonts w:ascii="Times New Roman" w:hAnsi="Times New Roman" w:eastAsia="Times New Roman" w:cs="Times New Roman"/>
           <w:b/>
           <w:i w:val="0"/>
+          <w:color w:val="000000"/>
           <w:sz w:val="32"/>
         </w:rPr>
         <w:t>Отчёт по лабораторной работе «Лр пример 1 САиМИС»</w:t>
@@ -29,82 +66,140 @@
     </w:p>
     <w:p>
       <w:pPr>
+        <w:ind w:firstLine="0"/>
+        <w:jc w:val="center"/>
+      </w:pPr>
+      <w:r>
+        <w:rPr>
+          <w:rFonts w:ascii="Times New Roman" w:hAnsi="Times New Roman" w:eastAsia="Times New Roman" w:cs="Times New Roman"/>
+          <w:b w:val="0"/>
+          <w:i/>
+          <w:color w:val="000000"/>
+          <w:sz w:val="26"/>
+        </w:rPr>
+        <w:t>Модель Q-схемы (СМО) с очередью типа D/D/1 в среде MATLAB/Simulink</w:t>
+      </w:r>
+    </w:p>
+    <w:p>
+      <w:pPr>
+        <w:ind w:firstLine="0"/>
+      </w:pPr>
+      <w:r>
+        <w:rPr>
+          <w:rFonts w:ascii="Times New Roman" w:hAnsi="Times New Roman" w:eastAsia="Times New Roman" w:cs="Times New Roman"/>
+          <w:b w:val="0"/>
+          <w:i w:val="0"/>
+          <w:color w:val="000000"/>
+          <w:sz w:val="20"/>
+        </w:rPr>
+      </w:r>
+    </w:p>
+    <w:p>
+      <w:pPr>
+        <w:ind w:firstLine="0"/>
         <w:jc w:val="right"/>
       </w:pPr>
       <w:r>
         <w:rPr>
+          <w:rFonts w:ascii="Times New Roman" w:hAnsi="Times New Roman" w:eastAsia="Times New Roman" w:cs="Times New Roman"/>
           <w:b w:val="0"/>
           <w:i w:val="0"/>
+          <w:color w:val="000000"/>
+          <w:sz w:val="28"/>
         </w:rPr>
-        <w:t>Выполнил(а): [ФИО], гр. [группа]</w:t>
+        <w:t>Выполнил: Мейер-Шишнёв Владислав Алексеевич</w:t>
       </w:r>
     </w:p>
     <w:p>
       <w:pPr>
-        <w:jc w:val="right"/>
+        <w:ind w:firstLine="0"/>
       </w:pPr>
       <w:r>
         <w:rPr>
+          <w:rFonts w:ascii="Times New Roman" w:hAnsi="Times New Roman" w:eastAsia="Times New Roman" w:cs="Times New Roman"/>
           <w:b w:val="0"/>
           <w:i w:val="0"/>
+          <w:color w:val="000000"/>
+          <w:sz w:val="16"/>
         </w:rPr>
-        <w:t>Проверил(а): [ФИО преподавателя]</w:t>
-      </w:r>
-    </w:p>
-    <w:p/>
-    <w:p>
-      <w:pPr>
-        <w:jc w:val="center"/>
-      </w:pPr>
-      <w:r>
-        <w:rPr>
-          <w:b w:val="0"/>
-          <w:i/>
-        </w:rPr>
-        <w:t>Тема: Модель Q-схемы (системы массового обслуживания) с очередью типа D/D/1 в среде MATLAB/Simulink</w:t>
       </w:r>
     </w:p>
     <w:p>
       <w:pPr>
         <w:pStyle w:val="Heading1"/>
+        <w:ind w:firstLine="0"/>
       </w:pPr>
       <w:r>
         <w:t>1. Цель работы</w:t>
       </w:r>
     </w:p>
     <w:p>
+      <w:pPr>
+        <w:ind w:firstLine="709"/>
+      </w:pPr>
       <w:r>
         <w:rPr>
+          <w:rFonts w:ascii="Times New Roman" w:hAnsi="Times New Roman" w:eastAsia="Times New Roman" w:cs="Times New Roman"/>
           <w:b w:val="0"/>
           <w:i w:val="0"/>
+          <w:color w:val="000000"/>
+          <w:sz w:val="28"/>
         </w:rPr>
-        <w:t>Построить в среде MATLAB/Simulink (библиотека SimEvents) простейшую систему массового обслуживания D/D/1, выполнить прогон модели и по результатам моделирования получить статистику работы системы: интервалы между заявками, времена обслуживания, времена ожидания в очереди и загрузку обслуживающего прибора.</w:t>
+        <w:t>Построить в MATLAB/Simulink (библиотека SimEvents) модель системы массового обслуживания D/D/1, выполнить прогон и по результатам моделирования получить статистику: интервалы между заявками, времена обслуживания, времена ожидания в очереди и загрузку обслуживающего прибора.</w:t>
       </w:r>
     </w:p>
     <w:p>
       <w:pPr>
         <w:pStyle w:val="Heading1"/>
+        <w:ind w:firstLine="0"/>
       </w:pPr>
       <w:r>
         <w:t>2. Описание моделируемого реального объекта и его настройки</w:t>
       </w:r>
     </w:p>
     <w:p>
+      <w:pPr>
+        <w:ind w:firstLine="709"/>
+      </w:pPr>
       <w:r>
         <w:rPr>
+          <w:rFonts w:ascii="Times New Roman" w:hAnsi="Times New Roman" w:eastAsia="Times New Roman" w:cs="Times New Roman"/>
           <w:b w:val="0"/>
           <w:i w:val="0"/>
+          <w:color w:val="000000"/>
+          <w:sz w:val="28"/>
         </w:rPr>
-        <w:t>Моделируемый реальный объект — сервер (узел обработки запросов), к которому с постоянным темпом поступают заявки на обслуживание. Заявки обслуживаются единственным сервером в порядке поступления (дисциплина FIFO). Такой тип системы обозначается нотацией Кепдалла как D/D/1: первое D — детерминированное время поступления заявок, второе D — время обслуживания с фиксированным (детерминированным) законом распределения, 1 — один обслуживающий прибор.</w:t>
+        <w:t>Моделируемый объект — сервер (узел обработки запросов), на вход которого заявки поступают с постоянным темпом. Обслуживание выполняет один прибор в порядке поступления (FIFO). По нотации Кендалла такая система обозначается D/D/1: первое D — детерминированное поступление, второе D — время обслуживания с фиксированным законом, 1 — один сервер.</w:t>
       </w:r>
     </w:p>
     <w:p>
+      <w:pPr>
+        <w:ind w:firstLine="709"/>
+      </w:pPr>
       <w:r>
         <w:rPr>
+          <w:rFonts w:ascii="Times New Roman" w:hAnsi="Times New Roman" w:eastAsia="Times New Roman" w:cs="Times New Roman"/>
           <w:b w:val="0"/>
           <w:i w:val="0"/>
+          <w:color w:val="000000"/>
+          <w:sz w:val="28"/>
         </w:rPr>
-        <w:t>Параметры реального объекта, принятые в модели (выявлены из описания модели):</w:t>
+        <w:t>Реальный аналог — касса, оператор или web-сервер, обрабатывающий запросы, которые приходят через равные промежутки времени. Среднее время обработки сопоставимо с периодом поступления, то есть система работает на пределе пропускной способности.</w:t>
+      </w:r>
+    </w:p>
+    <w:p>
+      <w:pPr>
+        <w:ind w:firstLine="709"/>
+      </w:pPr>
+      <w:r>
+        <w:rPr>
+          <w:rFonts w:ascii="Times New Roman" w:hAnsi="Times New Roman" w:eastAsia="Times New Roman" w:cs="Times New Roman"/>
+          <w:b w:val="0"/>
+          <w:i w:val="0"/>
+          <w:color w:val="000000"/>
+          <w:sz w:val="28"/>
+        </w:rPr>
+        <w:t>Настройки, принятые в модели:</w:t>
       </w:r>
     </w:p>
     <w:tbl>
@@ -124,11 +219,16 @@
             <w:tcW w:type="dxa" w:w="3685"/>
           </w:tcPr>
           <w:p>
+            <w:pPr>
+              <w:ind w:firstLine="0"/>
+            </w:pPr>
             <w:r/>
             <w:r>
               <w:rPr>
-                <w:rFonts w:ascii="Times New Roman" w:hAnsi="Times New Roman"/>
+                <w:rFonts w:ascii="Times New Roman" w:hAnsi="Times New Roman" w:eastAsia="Times New Roman" w:cs="Times New Roman"/>
                 <w:b/>
+                <w:i w:val="0"/>
+                <w:color w:val="000000"/>
                 <w:sz w:val="24"/>
               </w:rPr>
               <w:t>Параметр объекта</w:t>
@@ -140,11 +240,16 @@
             <w:tcW w:type="dxa" w:w="5102"/>
           </w:tcPr>
           <w:p>
+            <w:pPr>
+              <w:ind w:firstLine="0"/>
+            </w:pPr>
             <w:r/>
             <w:r>
               <w:rPr>
-                <w:rFonts w:ascii="Times New Roman" w:hAnsi="Times New Roman"/>
+                <w:rFonts w:ascii="Times New Roman" w:hAnsi="Times New Roman" w:eastAsia="Times New Roman" w:cs="Times New Roman"/>
                 <w:b/>
+                <w:i w:val="0"/>
+                <w:color w:val="000000"/>
                 <w:sz w:val="24"/>
               </w:rPr>
               <w:t>Значение в модели</w:t>
@@ -158,13 +263,19 @@
             <w:tcW w:type="dxa" w:w="3685"/>
           </w:tcPr>
           <w:p>
+            <w:pPr>
+              <w:ind w:firstLine="0"/>
+            </w:pPr>
             <w:r/>
             <w:r>
               <w:rPr>
-                <w:rFonts w:ascii="Times New Roman" w:hAnsi="Times New Roman"/>
+                <w:rFonts w:ascii="Times New Roman" w:hAnsi="Times New Roman" w:eastAsia="Times New Roman" w:cs="Times New Roman"/>
+                <w:b w:val="0"/>
+                <w:i w:val="0"/>
+                <w:color w:val="000000"/>
                 <w:sz w:val="24"/>
               </w:rPr>
-              <w:t>Темп поступления заявок (период)</w:t>
+              <w:t>Период поступления заявок</w:t>
             </w:r>
           </w:p>
         </w:tc>
@@ -173,13 +284,19 @@
             <w:tcW w:type="dxa" w:w="5102"/>
           </w:tcPr>
           <w:p>
+            <w:pPr>
+              <w:ind w:firstLine="0"/>
+            </w:pPr>
             <w:r/>
             <w:r>
               <w:rPr>
-                <w:rFonts w:ascii="Times New Roman" w:hAnsi="Times New Roman"/>
+                <w:rFonts w:ascii="Times New Roman" w:hAnsi="Times New Roman" w:eastAsia="Times New Roman" w:cs="Times New Roman"/>
+                <w:b w:val="0"/>
+                <w:i w:val="0"/>
+                <w:color w:val="000000"/>
                 <w:sz w:val="24"/>
               </w:rPr>
-              <w:t>2 с, детерминированно (заявка ровно каждые 2 с)</w:t>
+              <w:t>2 с, детерминированно (Time-Based Entity Generator, Period = 2)</w:t>
             </w:r>
           </w:p>
         </w:tc>
@@ -190,13 +307,19 @@
             <w:tcW w:type="dxa" w:w="3685"/>
           </w:tcPr>
           <w:p>
+            <w:pPr>
+              <w:ind w:firstLine="0"/>
+            </w:pPr>
             <w:r/>
             <w:r>
               <w:rPr>
-                <w:rFonts w:ascii="Times New Roman" w:hAnsi="Times New Roman"/>
+                <w:rFonts w:ascii="Times New Roman" w:hAnsi="Times New Roman" w:eastAsia="Times New Roman" w:cs="Times New Roman"/>
+                <w:b w:val="0"/>
+                <w:i w:val="0"/>
+                <w:color w:val="000000"/>
                 <w:sz w:val="24"/>
               </w:rPr>
-              <w:t>Время обслуживания заявки</w:t>
+              <w:t>Время обслуживания</w:t>
             </w:r>
           </w:p>
         </w:tc>
@@ -205,13 +328,19 @@
             <w:tcW w:type="dxa" w:w="5102"/>
           </w:tcPr>
           <w:p>
+            <w:pPr>
+              <w:ind w:firstLine="0"/>
+            </w:pPr>
             <w:r/>
             <w:r>
               <w:rPr>
-                <w:rFonts w:ascii="Times New Roman" w:hAnsi="Times New Roman"/>
+                <w:rFonts w:ascii="Times New Roman" w:hAnsi="Times New Roman" w:eastAsia="Times New Roman" w:cs="Times New Roman"/>
+                <w:b w:val="0"/>
+                <w:i w:val="0"/>
+                <w:color w:val="000000"/>
                 <w:sz w:val="24"/>
               </w:rPr>
-              <w:t>случайное, равномерное распределение на отрезке 1,5…2,5 с (среднее 2 с)</w:t>
+              <w:t>равномерное распределение на отрезке 1,5…2,5 с (среднее 2 с)</w:t>
             </w:r>
           </w:p>
         </w:tc>
@@ -222,13 +351,19 @@
             <w:tcW w:type="dxa" w:w="3685"/>
           </w:tcPr>
           <w:p>
+            <w:pPr>
+              <w:ind w:firstLine="0"/>
+            </w:pPr>
             <w:r/>
             <w:r>
               <w:rPr>
-                <w:rFonts w:ascii="Times New Roman" w:hAnsi="Times New Roman"/>
+                <w:rFonts w:ascii="Times New Roman" w:hAnsi="Times New Roman" w:eastAsia="Times New Roman" w:cs="Times New Roman"/>
+                <w:b w:val="0"/>
+                <w:i w:val="0"/>
+                <w:color w:val="000000"/>
                 <w:sz w:val="24"/>
               </w:rPr>
-              <w:t>Число обслуживающих приборов</w:t>
+              <w:t>Число приборов</w:t>
             </w:r>
           </w:p>
         </w:tc>
@@ -237,13 +372,19 @@
             <w:tcW w:type="dxa" w:w="5102"/>
           </w:tcPr>
           <w:p>
+            <w:pPr>
+              <w:ind w:firstLine="0"/>
+            </w:pPr>
             <w:r/>
             <w:r>
               <w:rPr>
-                <w:rFonts w:ascii="Times New Roman" w:hAnsi="Times New Roman"/>
+                <w:rFonts w:ascii="Times New Roman" w:hAnsi="Times New Roman" w:eastAsia="Times New Roman" w:cs="Times New Roman"/>
+                <w:b w:val="0"/>
+                <w:i w:val="0"/>
+                <w:color w:val="000000"/>
                 <w:sz w:val="24"/>
               </w:rPr>
-              <w:t>1 сервер</w:t>
+              <w:t>1 (Single Server)</w:t>
             </w:r>
           </w:p>
         </w:tc>
@@ -254,13 +395,19 @@
             <w:tcW w:type="dxa" w:w="3685"/>
           </w:tcPr>
           <w:p>
+            <w:pPr>
+              <w:ind w:firstLine="0"/>
+            </w:pPr>
             <w:r/>
             <w:r>
               <w:rPr>
-                <w:rFonts w:ascii="Times New Roman" w:hAnsi="Times New Roman"/>
+                <w:rFonts w:ascii="Times New Roman" w:hAnsi="Times New Roman" w:eastAsia="Times New Roman" w:cs="Times New Roman"/>
+                <w:b w:val="0"/>
+                <w:i w:val="0"/>
+                <w:color w:val="000000"/>
                 <w:sz w:val="24"/>
               </w:rPr>
-              <w:t>Дисциплина обслуживания</w:t>
+              <w:t>Дисциплина очереди</w:t>
             </w:r>
           </w:p>
         </w:tc>
@@ -269,13 +416,19 @@
             <w:tcW w:type="dxa" w:w="5102"/>
           </w:tcPr>
           <w:p>
+            <w:pPr>
+              <w:ind w:firstLine="0"/>
+            </w:pPr>
             <w:r/>
             <w:r>
               <w:rPr>
-                <w:rFonts w:ascii="Times New Roman" w:hAnsi="Times New Roman"/>
+                <w:rFonts w:ascii="Times New Roman" w:hAnsi="Times New Roman" w:eastAsia="Times New Roman" w:cs="Times New Roman"/>
+                <w:b w:val="0"/>
+                <w:i w:val="0"/>
+                <w:color w:val="000000"/>
                 <w:sz w:val="24"/>
               </w:rPr>
-              <w:t>FIFO — «первый пришёл, первый обслужен» (блок FIFO Queue)</w:t>
+              <w:t>FIFO (блок FIFO Queue)</w:t>
             </w:r>
           </w:p>
         </w:tc>
@@ -286,13 +439,19 @@
             <w:tcW w:type="dxa" w:w="3685"/>
           </w:tcPr>
           <w:p>
+            <w:pPr>
+              <w:ind w:firstLine="0"/>
+            </w:pPr>
             <w:r/>
             <w:r>
               <w:rPr>
-                <w:rFonts w:ascii="Times New Roman" w:hAnsi="Times New Roman"/>
+                <w:rFonts w:ascii="Times New Roman" w:hAnsi="Times New Roman" w:eastAsia="Times New Roman" w:cs="Times New Roman"/>
+                <w:b w:val="0"/>
+                <w:i w:val="0"/>
+                <w:color w:val="000000"/>
                 <w:sz w:val="24"/>
               </w:rPr>
-              <w:t>Вместимость очереди (буфера)</w:t>
+              <w:t>Ёмкость очереди</w:t>
             </w:r>
           </w:p>
         </w:tc>
@@ -301,10 +460,16 @@
             <w:tcW w:type="dxa" w:w="5102"/>
           </w:tcPr>
           <w:p>
+            <w:pPr>
+              <w:ind w:firstLine="0"/>
+            </w:pPr>
             <w:r/>
             <w:r>
               <w:rPr>
-                <w:rFonts w:ascii="Times New Roman" w:hAnsi="Times New Roman"/>
+                <w:rFonts w:ascii="Times New Roman" w:hAnsi="Times New Roman" w:eastAsia="Times New Roman" w:cs="Times New Roman"/>
+                <w:b w:val="0"/>
+                <w:i w:val="0"/>
+                <w:color w:val="000000"/>
                 <w:sz w:val="24"/>
               </w:rPr>
               <w:t>25 заявок</w:t>
@@ -318,13 +483,19 @@
             <w:tcW w:type="dxa" w:w="3685"/>
           </w:tcPr>
           <w:p>
+            <w:pPr>
+              <w:ind w:firstLine="0"/>
+            </w:pPr>
             <w:r/>
             <w:r>
               <w:rPr>
-                <w:rFonts w:ascii="Times New Roman" w:hAnsi="Times New Roman"/>
+                <w:rFonts w:ascii="Times New Roman" w:hAnsi="Times New Roman" w:eastAsia="Times New Roman" w:cs="Times New Roman"/>
+                <w:b w:val="0"/>
+                <w:i w:val="0"/>
+                <w:color w:val="000000"/>
                 <w:sz w:val="24"/>
               </w:rPr>
-              <w:t>Режим работы</w:t>
+              <w:t>Коэффициент загрузки</w:t>
             </w:r>
           </w:p>
         </w:tc>
@@ -333,13 +504,19 @@
             <w:tcW w:type="dxa" w:w="5102"/>
           </w:tcPr>
           <w:p>
+            <w:pPr>
+              <w:ind w:firstLine="0"/>
+            </w:pPr>
             <w:r/>
             <w:r>
               <w:rPr>
-                <w:rFonts w:ascii="Times New Roman" w:hAnsi="Times New Roman"/>
+                <w:rFonts w:ascii="Times New Roman" w:hAnsi="Times New Roman" w:eastAsia="Times New Roman" w:cs="Times New Roman"/>
+                <w:b w:val="0"/>
+                <w:i w:val="0"/>
+                <w:color w:val="000000"/>
                 <w:sz w:val="24"/>
               </w:rPr>
-              <w:t>λ = 0,5 заявки/с, E[S] = 2 с ⇒ коэффициент загрузки ρ = λ·E[S] = 1 — граница устойчивости</w:t>
+              <w:t>λ = 0,5 1/с, E[S] = 2 с ⇒ ρ = λ·E[S] = 1 (граница устойчивости)</w:t>
             </w:r>
           </w:p>
         </w:tc>
@@ -350,13 +527,19 @@
             <w:tcW w:type="dxa" w:w="3685"/>
           </w:tcPr>
           <w:p>
+            <w:pPr>
+              <w:ind w:firstLine="0"/>
+            </w:pPr>
             <w:r/>
             <w:r>
               <w:rPr>
-                <w:rFonts w:ascii="Times New Roman" w:hAnsi="Times New Roman"/>
+                <w:rFonts w:ascii="Times New Roman" w:hAnsi="Times New Roman" w:eastAsia="Times New Roman" w:cs="Times New Roman"/>
+                <w:b w:val="0"/>
+                <w:i w:val="0"/>
+                <w:color w:val="000000"/>
                 <w:sz w:val="24"/>
               </w:rPr>
-              <w:t>Масштаб времени модели</w:t>
+              <w:t>Масштаб времени</w:t>
             </w:r>
           </w:p>
         </w:tc>
@@ -365,51 +548,75 @@
             <w:tcW w:type="dxa" w:w="5102"/>
           </w:tcPr>
           <w:p>
+            <w:pPr>
+              <w:ind w:firstLine="0"/>
+            </w:pPr>
             <w:r/>
             <w:r>
               <w:rPr>
-                <w:rFonts w:ascii="Times New Roman" w:hAnsi="Times New Roman"/>
+                <w:rFonts w:ascii="Times New Roman" w:hAnsi="Times New Roman" w:eastAsia="Times New Roman" w:cs="Times New Roman"/>
+                <w:b w:val="0"/>
+                <w:i w:val="0"/>
+                <w:color w:val="000000"/>
                 <w:sz w:val="24"/>
               </w:rPr>
-              <w:t>1 с модели = 1 с реального времени; время прогона — 50 с</w:t>
+              <w:t>1 с модели = 1 с реального времени</w:t>
             </w:r>
           </w:p>
         </w:tc>
       </w:tr>
     </w:tbl>
     <w:p>
+      <w:pPr>
+        <w:ind w:firstLine="0"/>
+      </w:pPr>
       <w:r>
         <w:rPr>
+          <w:rFonts w:ascii="Times New Roman" w:hAnsi="Times New Roman" w:eastAsia="Times New Roman" w:cs="Times New Roman"/>
           <w:b w:val="0"/>
           <w:i w:val="0"/>
+          <w:color w:val="000000"/>
+          <w:sz w:val="12"/>
         </w:rPr>
-        <w:t>Реальный аналог: web-сервер, касса или оператор, обрабатывающие запросы, приходящие с фиксированным интервалом; интервал поступления равен среднему времени обработки — система работает на пределе своей пропускной способности.</w:t>
       </w:r>
     </w:p>
     <w:p>
       <w:pPr>
         <w:pStyle w:val="Heading1"/>
+        <w:ind w:firstLine="0"/>
       </w:pPr>
       <w:r>
-        <w:t>3. Цель создания модели и получаемая при прогоне статистические данные</w:t>
+        <w:t>3. Цель создания модели. Статистика, получаемая при прогоне</w:t>
       </w:r>
     </w:p>
     <w:p>
+      <w:pPr>
+        <w:ind w:firstLine="709"/>
+      </w:pPr>
       <w:r>
         <w:rPr>
+          <w:rFonts w:ascii="Times New Roman" w:hAnsi="Times New Roman" w:eastAsia="Times New Roman" w:cs="Times New Roman"/>
           <w:b w:val="0"/>
           <w:i w:val="0"/>
+          <w:color w:val="000000"/>
+          <w:sz w:val="28"/>
         </w:rPr>
-        <w:t>Цель создания модели: проверить на простейшей Q-схеме поведение СМО в критическом режиме (темп поступления равен среднему темпу обслуживания) и получить наглядные показатели её работы.</w:t>
+        <w:t>Модель нужна, чтобы на простой Q-схеме посмотреть поведение СМО в критическом режиме (темп поступления равен среднему темпу обслуживания) и снять показатели работы сервера.</w:t>
       </w:r>
     </w:p>
     <w:p>
+      <w:pPr>
+        <w:ind w:firstLine="709"/>
+      </w:pPr>
       <w:r>
         <w:rPr>
+          <w:rFonts w:ascii="Times New Roman" w:hAnsi="Times New Roman" w:eastAsia="Times New Roman" w:cs="Times New Roman"/>
           <w:b w:val="0"/>
           <w:i w:val="0"/>
+          <w:color w:val="000000"/>
+          <w:sz w:val="28"/>
         </w:rPr>
-        <w:t>При прогоне модели регистрируются следующие статистические данные:</w:t>
+        <w:t>При прогоне снимаются следующие данные:</w:t>
       </w:r>
     </w:p>
     <w:tbl>
@@ -429,14 +636,19 @@
             <w:tcW w:type="dxa" w:w="3118"/>
           </w:tcPr>
           <w:p>
+            <w:pPr>
+              <w:ind w:firstLine="0"/>
+            </w:pPr>
             <w:r/>
             <w:r>
               <w:rPr>
-                <w:rFonts w:ascii="Times New Roman" w:hAnsi="Times New Roman"/>
+                <w:rFonts w:ascii="Times New Roman" w:hAnsi="Times New Roman" w:eastAsia="Times New Roman" w:cs="Times New Roman"/>
                 <w:b/>
+                <w:i w:val="0"/>
+                <w:color w:val="000000"/>
                 <w:sz w:val="24"/>
               </w:rPr>
-              <w:t>Блок визуализации</w:t>
+              <w:t>Источник</w:t>
             </w:r>
           </w:p>
         </w:tc>
@@ -445,14 +657,19 @@
             <w:tcW w:type="dxa" w:w="5669"/>
           </w:tcPr>
           <w:p>
+            <w:pPr>
+              <w:ind w:firstLine="0"/>
+            </w:pPr>
             <w:r/>
             <w:r>
               <w:rPr>
-                <w:rFonts w:ascii="Times New Roman" w:hAnsi="Times New Roman"/>
+                <w:rFonts w:ascii="Times New Roman" w:hAnsi="Times New Roman" w:eastAsia="Times New Roman" w:cs="Times New Roman"/>
                 <w:b/>
+                <w:i w:val="0"/>
+                <w:color w:val="000000"/>
                 <w:sz w:val="24"/>
               </w:rPr>
-              <w:t>Что показывает (статистика)</w:t>
+              <w:t>Что получается</w:t>
             </w:r>
           </w:p>
         </w:tc>
@@ -463,10 +680,16 @@
             <w:tcW w:type="dxa" w:w="3118"/>
           </w:tcPr>
           <w:p>
+            <w:pPr>
+              <w:ind w:firstLine="0"/>
+            </w:pPr>
             <w:r/>
             <w:r>
               <w:rPr>
-                <w:rFonts w:ascii="Times New Roman" w:hAnsi="Times New Roman"/>
+                <w:rFonts w:ascii="Times New Roman" w:hAnsi="Times New Roman" w:eastAsia="Times New Roman" w:cs="Times New Roman"/>
+                <w:b w:val="0"/>
+                <w:i w:val="0"/>
+                <w:color w:val="000000"/>
                 <w:sz w:val="24"/>
               </w:rPr>
               <w:t>Signal Scope «InterTime»</w:t>
@@ -478,13 +701,19 @@
             <w:tcW w:type="dxa" w:w="5669"/>
           </w:tcPr>
           <w:p>
+            <w:pPr>
+              <w:ind w:firstLine="0"/>
+            </w:pPr>
             <w:r/>
             <w:r>
               <w:rPr>
-                <w:rFonts w:ascii="Times New Roman" w:hAnsi="Times New Roman"/>
+                <w:rFonts w:ascii="Times New Roman" w:hAnsi="Times New Roman" w:eastAsia="Times New Roman" w:cs="Times New Roman"/>
+                <w:b w:val="0"/>
+                <w:i w:val="0"/>
+                <w:color w:val="000000"/>
                 <w:sz w:val="24"/>
               </w:rPr>
-              <w:t>интервалы времени между поступающими заявками (по оси X — время, по оси Y — интервал)</w:t>
+              <w:t>интервалы между поступающими заявками (X — время, Y — интервал, с)</w:t>
             </w:r>
           </w:p>
         </w:tc>
@@ -495,10 +724,16 @@
             <w:tcW w:type="dxa" w:w="3118"/>
           </w:tcPr>
           <w:p>
+            <w:pPr>
+              <w:ind w:firstLine="0"/>
+            </w:pPr>
             <w:r/>
             <w:r>
               <w:rPr>
-                <w:rFonts w:ascii="Times New Roman" w:hAnsi="Times New Roman"/>
+                <w:rFonts w:ascii="Times New Roman" w:hAnsi="Times New Roman" w:eastAsia="Times New Roman" w:cs="Times New Roman"/>
+                <w:b w:val="0"/>
+                <w:i w:val="0"/>
+                <w:color w:val="000000"/>
                 <w:sz w:val="24"/>
               </w:rPr>
               <w:t>Signal Scope «Service Time»</w:t>
@@ -510,13 +745,19 @@
             <w:tcW w:type="dxa" w:w="5669"/>
           </w:tcPr>
           <w:p>
+            <w:pPr>
+              <w:ind w:firstLine="0"/>
+            </w:pPr>
             <w:r/>
             <w:r>
               <w:rPr>
-                <w:rFonts w:ascii="Times New Roman" w:hAnsi="Times New Roman"/>
+                <w:rFonts w:ascii="Times New Roman" w:hAnsi="Times New Roman" w:eastAsia="Times New Roman" w:cs="Times New Roman"/>
+                <w:b w:val="0"/>
+                <w:i w:val="0"/>
+                <w:color w:val="000000"/>
                 <w:sz w:val="24"/>
               </w:rPr>
-              <w:t>последовательность псевдослучайных времён обслуживания заявок сервером</w:t>
+              <w:t>времена обслуживания заявок сервером, с</w:t>
             </w:r>
           </w:p>
         </w:tc>
@@ -527,10 +768,16 @@
             <w:tcW w:type="dxa" w:w="3118"/>
           </w:tcPr>
           <w:p>
+            <w:pPr>
+              <w:ind w:firstLine="0"/>
+            </w:pPr>
             <w:r/>
             <w:r>
               <w:rPr>
-                <w:rFonts w:ascii="Times New Roman" w:hAnsi="Times New Roman"/>
+                <w:rFonts w:ascii="Times New Roman" w:hAnsi="Times New Roman" w:eastAsia="Times New Roman" w:cs="Times New Roman"/>
+                <w:b w:val="0"/>
+                <w:i w:val="0"/>
+                <w:color w:val="000000"/>
                 <w:sz w:val="24"/>
               </w:rPr>
               <w:t>Signal Scope «Wait Time»</w:t>
@@ -542,13 +789,19 @@
             <w:tcW w:type="dxa" w:w="5669"/>
           </w:tcPr>
           <w:p>
+            <w:pPr>
+              <w:ind w:firstLine="0"/>
+            </w:pPr>
             <w:r/>
             <w:r>
               <w:rPr>
-                <w:rFonts w:ascii="Times New Roman" w:hAnsi="Times New Roman"/>
+                <w:rFonts w:ascii="Times New Roman" w:hAnsi="Times New Roman" w:eastAsia="Times New Roman" w:cs="Times New Roman"/>
+                <w:b w:val="0"/>
+                <w:i w:val="0"/>
+                <w:color w:val="000000"/>
                 <w:sz w:val="24"/>
               </w:rPr>
-              <w:t>время ожидания каждой заявки в очереди перед обслуживающим прибором (ось X — заявка, ось Y — время ожидания)</w:t>
+              <w:t>время ожидания каждой заявки в очереди, с</w:t>
             </w:r>
           </w:p>
         </w:tc>
@@ -559,10 +812,16 @@
             <w:tcW w:type="dxa" w:w="3118"/>
           </w:tcPr>
           <w:p>
+            <w:pPr>
+              <w:ind w:firstLine="0"/>
+            </w:pPr>
             <w:r/>
             <w:r>
               <w:rPr>
-                <w:rFonts w:ascii="Times New Roman" w:hAnsi="Times New Roman"/>
+                <w:rFonts w:ascii="Times New Roman" w:hAnsi="Times New Roman" w:eastAsia="Times New Roman" w:cs="Times New Roman"/>
+                <w:b w:val="0"/>
+                <w:i w:val="0"/>
+                <w:color w:val="000000"/>
                 <w:sz w:val="24"/>
               </w:rPr>
               <w:t>Signal Scope «Utilization»</w:t>
@@ -574,13 +833,19 @@
             <w:tcW w:type="dxa" w:w="5669"/>
           </w:tcPr>
           <w:p>
+            <w:pPr>
+              <w:ind w:firstLine="0"/>
+            </w:pPr>
             <w:r/>
             <w:r>
               <w:rPr>
-                <w:rFonts w:ascii="Times New Roman" w:hAnsi="Times New Roman"/>
+                <w:rFonts w:ascii="Times New Roman" w:hAnsi="Times New Roman" w:eastAsia="Times New Roman" w:cs="Times New Roman"/>
+                <w:b w:val="0"/>
+                <w:i w:val="0"/>
+                <w:color w:val="000000"/>
                 <w:sz w:val="24"/>
               </w:rPr>
-              <w:t>загрузка сервера при обслуживании каждой заявки (ось X — номер заявки, ось Y — загрузка 0…1)</w:t>
+              <w:t>загрузка сервера (0…1)</w:t>
             </w:r>
           </w:p>
         </w:tc>
@@ -591,10 +856,16 @@
             <w:tcW w:type="dxa" w:w="3118"/>
           </w:tcPr>
           <w:p>
+            <w:pPr>
+              <w:ind w:firstLine="0"/>
+            </w:pPr>
             <w:r/>
             <w:r>
               <w:rPr>
-                <w:rFonts w:ascii="Times New Roman" w:hAnsi="Times New Roman"/>
+                <w:rFonts w:ascii="Times New Roman" w:hAnsi="Times New Roman" w:eastAsia="Times New Roman" w:cs="Times New Roman"/>
+                <w:b w:val="0"/>
+                <w:i w:val="0"/>
+                <w:color w:val="000000"/>
                 <w:sz w:val="24"/>
               </w:rPr>
               <w:t>Display</w:t>
@@ -606,13 +877,19 @@
             <w:tcW w:type="dxa" w:w="5669"/>
           </w:tcPr>
           <w:p>
+            <w:pPr>
+              <w:ind w:firstLine="0"/>
+            </w:pPr>
             <w:r/>
             <w:r>
               <w:rPr>
-                <w:rFonts w:ascii="Times New Roman" w:hAnsi="Times New Roman"/>
+                <w:rFonts w:ascii="Times New Roman" w:hAnsi="Times New Roman" w:eastAsia="Times New Roman" w:cs="Times New Roman"/>
+                <w:b w:val="0"/>
+                <w:i w:val="0"/>
+                <w:color w:val="000000"/>
                 <w:sz w:val="24"/>
               </w:rPr>
-              <w:t>количество сформированных заявок на обслуживание (статистика #d генератора)</w:t>
+              <w:t>число сформированных заявок (#d генератора)</w:t>
             </w:r>
           </w:p>
         </w:tc>
@@ -623,13 +900,19 @@
             <w:tcW w:type="dxa" w:w="3118"/>
           </w:tcPr>
           <w:p>
+            <w:pPr>
+              <w:ind w:firstLine="0"/>
+            </w:pPr>
             <w:r/>
             <w:r>
               <w:rPr>
-                <w:rFonts w:ascii="Times New Roman" w:hAnsi="Times New Roman"/>
+                <w:rFonts w:ascii="Times New Roman" w:hAnsi="Times New Roman" w:eastAsia="Times New Roman" w:cs="Times New Roman"/>
+                <w:b w:val="0"/>
+                <w:i w:val="0"/>
+                <w:color w:val="000000"/>
                 <w:sz w:val="24"/>
               </w:rPr>
-              <w:t>Статистика генератора</w:t>
+              <w:t>FIFO Queue, Average wait</w:t>
             </w:r>
           </w:p>
         </w:tc>
@@ -638,124 +921,99 @@
             <w:tcW w:type="dxa" w:w="5669"/>
           </w:tcPr>
           <w:p>
+            <w:pPr>
+              <w:ind w:firstLine="0"/>
+            </w:pPr>
             <w:r/>
             <w:r>
               <w:rPr>
-                <w:rFonts w:ascii="Times New Roman" w:hAnsi="Times New Roman"/>
+                <w:rFonts w:ascii="Times New Roman" w:hAnsi="Times New Roman" w:eastAsia="Times New Roman" w:cs="Times New Roman"/>
+                <w:b w:val="0"/>
+                <w:i w:val="0"/>
+                <w:color w:val="000000"/>
                 <w:sz w:val="24"/>
               </w:rPr>
-              <w:t>среднее время между генерациями заявок (Average intergeneration time)</w:t>
-            </w:r>
-          </w:p>
-        </w:tc>
-      </w:tr>
-      <w:tr>
-        <w:tc>
-          <w:tcPr>
-            <w:tcW w:type="dxa" w:w="3118"/>
-          </w:tcPr>
-          <w:p>
-            <w:r/>
-            <w:r>
-              <w:rPr>
-                <w:rFonts w:ascii="Times New Roman" w:hAnsi="Times New Roman"/>
-                <w:sz w:val="24"/>
-              </w:rPr>
-              <w:t>Статистика очереди</w:t>
-            </w:r>
-          </w:p>
-        </w:tc>
-        <w:tc>
-          <w:tcPr>
-            <w:tcW w:type="dxa" w:w="5669"/>
-          </w:tcPr>
-          <w:p>
-            <w:r/>
-            <w:r>
-              <w:rPr>
-                <w:rFonts w:ascii="Times New Roman" w:hAnsi="Times New Roman"/>
-                <w:sz w:val="24"/>
-              </w:rPr>
-              <w:t>среднее время ожидания заявки в очереди (Average wait)</w:t>
+              <w:t>среднее время ожидания в очереди</w:t>
             </w:r>
           </w:p>
         </w:tc>
       </w:tr>
     </w:tbl>
     <w:p>
+      <w:pPr>
+        <w:ind w:firstLine="0"/>
+      </w:pPr>
       <w:r>
         <w:rPr>
+          <w:rFonts w:ascii="Times New Roman" w:hAnsi="Times New Roman" w:eastAsia="Times New Roman" w:cs="Times New Roman"/>
           <w:b w:val="0"/>
           <w:i w:val="0"/>
+          <w:color w:val="000000"/>
+          <w:sz w:val="12"/>
         </w:rPr>
-        <w:t>Эти данные позволяют судить о пропускной способности системы, загрузке сервера и накоплении задержек в очереди.</w:t>
       </w:r>
     </w:p>
     <w:p>
       <w:pPr>
         <w:pStyle w:val="Heading1"/>
+        <w:ind w:firstLine="0"/>
       </w:pPr>
       <w:r>
-        <w:t>4. Обоснование времени прогона модели</w:t>
-      </w:r>
-    </w:p>
-    <w:p>
-      <w:r>
-        <w:rPr>
-          <w:b w:val="0"/>
-          <w:i w:val="0"/>
-        </w:rPr>
-        <w:t>Время прогона обосновывается свойствами реального объекта (см. п. 2):</w:t>
+        <w:t>4. Обоснование времени прогона</w:t>
       </w:r>
     </w:p>
     <w:p>
       <w:pPr>
-        <w:pStyle w:val="ListBullet"/>
+        <w:ind w:firstLine="709"/>
       </w:pPr>
       <w:r>
-        <w:t>период поступления заявок равен 2 с, поэтому за время прогона 50 с в систему поступает 25 заявок, т.е. выполняется 25 циклов обслуживания — этого достаточно, чтобы наблюдать установившийся режим и обе характерные ситуации: обслуживание быстрее 2 с (очередь рассасывается) и медленнее 2 с (очередь растёт);</w:t>
+        <w:rPr>
+          <w:rFonts w:ascii="Times New Roman" w:hAnsi="Times New Roman" w:eastAsia="Times New Roman" w:cs="Times New Roman"/>
+          <w:b w:val="0"/>
+          <w:i w:val="0"/>
+          <w:color w:val="000000"/>
+          <w:sz w:val="28"/>
+        </w:rPr>
+        <w:t>Период поступления заявок равен 2 с, поэтому за 50 с в систему входит 25 заявок — 25 полных циклов обслуживания. Этого хватает, чтобы увидеть и участок, где обслуживание быстрее 2 с (очередь рассасывается), и участок, где обслуживание дольше 2 с (очередь подрастает).</w:t>
       </w:r>
     </w:p>
     <w:p>
       <w:pPr>
-        <w:pStyle w:val="ListBullet"/>
+        <w:ind w:firstLine="709"/>
       </w:pPr>
       <w:r>
-        <w:t>для получения наглядной статистики необходимо не менее 20–30 наблюдений (циклов обслуживания): 30 циклов × 2 с = 60 с, принятое значение 50 с (25 заявок) близко к этому минимуму; для строгой статистики рекомендуется 300–500 с (150–250 заявок);</w:t>
-      </w:r>
-    </w:p>
-    <w:p>
-      <w:pPr>
-        <w:pStyle w:val="ListBullet"/>
-      </w:pPr>
-      <w:r>
-        <w:t>реальный объект: пиковая нагрузка на сервер длится минуты; 50 с модели соответствуют ≈ 1 минуте наблюдения за напряжённой работой сервера — типичному «эпизоду» измерений на реальном узле.</w:t>
-      </w:r>
-    </w:p>
-    <w:p>
-      <w:r>
         <w:rPr>
+          <w:rFonts w:ascii="Times New Roman" w:hAnsi="Times New Roman" w:eastAsia="Times New Roman" w:cs="Times New Roman"/>
           <w:b w:val="0"/>
           <w:i w:val="0"/>
+          <w:color w:val="000000"/>
+          <w:sz w:val="28"/>
         </w:rPr>
-        <w:t>Вывод: время прогона 50 с обосновано периодом поступления заявок (2 с) и необходимостью наблюдать не менее 20–30 циклов обслуживания; при этом в систему поступает 25 заявок — статистически значимая для учебного эксперимента выборка.</w:t>
+        <w:t>Для учебного эксперимента достаточно 20–30 наблюдений. 25 заявок как раз попадают в этот диапазон. С точки зрения реального объекта 50 с — это короткий, но характерный эпизод пиковой нагрузки на сервер (около минуты непрерывной работы без пауз). Поэтому время прогона принято равным 50 с (Stop time = 50).</w:t>
       </w:r>
     </w:p>
     <w:p>
       <w:pPr>
         <w:pStyle w:val="Heading1"/>
+        <w:ind w:firstLine="0"/>
       </w:pPr>
       <w:r>
-        <w:t>5. Состав модели и конфигурирование блоков</w:t>
+        <w:t>5. Состав модели</w:t>
       </w:r>
     </w:p>
     <w:p>
+      <w:pPr>
+        <w:ind w:firstLine="709"/>
+      </w:pPr>
       <w:r>
         <w:rPr>
+          <w:rFonts w:ascii="Times New Roman" w:hAnsi="Times New Roman" w:eastAsia="Times New Roman" w:cs="Times New Roman"/>
           <w:b w:val="0"/>
           <w:i w:val="0"/>
+          <w:color w:val="000000"/>
+          <w:sz w:val="28"/>
         </w:rPr>
-        <w:t>Для построения модели использованы блоки библиотеки SimEvents:</w:t>
+        <w:t>Модель собрана из блоков библиотеки SimEvents:</w:t>
       </w:r>
     </w:p>
     <w:tbl>
@@ -773,14 +1031,19 @@
       <w:tr>
         <w:tc>
           <w:tcPr>
-            <w:tcW w:type="dxa" w:w="2835"/>
+            <w:tcW w:type="dxa" w:w="2948"/>
           </w:tcPr>
           <w:p>
+            <w:pPr>
+              <w:ind w:firstLine="0"/>
+            </w:pPr>
             <w:r/>
             <w:r>
               <w:rPr>
-                <w:rFonts w:ascii="Times New Roman" w:hAnsi="Times New Roman"/>
+                <w:rFonts w:ascii="Times New Roman" w:hAnsi="Times New Roman" w:eastAsia="Times New Roman" w:cs="Times New Roman"/>
                 <w:b/>
+                <w:i w:val="0"/>
+                <w:color w:val="000000"/>
                 <w:sz w:val="24"/>
               </w:rPr>
               <w:t>Блок</w:t>
@@ -789,14 +1052,19 @@
         </w:tc>
         <w:tc>
           <w:tcPr>
-            <w:tcW w:type="dxa" w:w="3118"/>
+            <w:tcW w:type="dxa" w:w="3005"/>
           </w:tcPr>
           <w:p>
+            <w:pPr>
+              <w:ind w:firstLine="0"/>
+            </w:pPr>
             <w:r/>
             <w:r>
               <w:rPr>
-                <w:rFonts w:ascii="Times New Roman" w:hAnsi="Times New Roman"/>
+                <w:rFonts w:ascii="Times New Roman" w:hAnsi="Times New Roman" w:eastAsia="Times New Roman" w:cs="Times New Roman"/>
                 <w:b/>
+                <w:i w:val="0"/>
+                <w:color w:val="000000"/>
                 <w:sz w:val="24"/>
               </w:rPr>
               <w:t>Назначение</w:t>
@@ -808,14 +1076,19 @@
             <w:tcW w:type="dxa" w:w="2835"/>
           </w:tcPr>
           <w:p>
+            <w:pPr>
+              <w:ind w:firstLine="0"/>
+            </w:pPr>
             <w:r/>
             <w:r>
               <w:rPr>
-                <w:rFonts w:ascii="Times New Roman" w:hAnsi="Times New Roman"/>
+                <w:rFonts w:ascii="Times New Roman" w:hAnsi="Times New Roman" w:eastAsia="Times New Roman" w:cs="Times New Roman"/>
                 <w:b/>
+                <w:i w:val="0"/>
+                <w:color w:val="000000"/>
                 <w:sz w:val="24"/>
               </w:rPr>
-              <w:t>Ключевые параметры</w:t>
+              <w:t>Параметры</w:t>
             </w:r>
           </w:p>
         </w:tc>
@@ -823,13 +1096,19 @@
       <w:tr>
         <w:tc>
           <w:tcPr>
-            <w:tcW w:type="dxa" w:w="2835"/>
+            <w:tcW w:type="dxa" w:w="2948"/>
           </w:tcPr>
           <w:p>
+            <w:pPr>
+              <w:ind w:firstLine="0"/>
+            </w:pPr>
             <w:r/>
             <w:r>
               <w:rPr>
-                <w:rFonts w:ascii="Times New Roman" w:hAnsi="Times New Roman"/>
+                <w:rFonts w:ascii="Times New Roman" w:hAnsi="Times New Roman" w:eastAsia="Times New Roman" w:cs="Times New Roman"/>
+                <w:b w:val="0"/>
+                <w:i w:val="0"/>
+                <w:color w:val="000000"/>
                 <w:sz w:val="24"/>
               </w:rPr>
               <w:t>Time-Based Entity Generator</w:t>
@@ -838,16 +1117,22 @@
         </w:tc>
         <w:tc>
           <w:tcPr>
-            <w:tcW w:type="dxa" w:w="3118"/>
+            <w:tcW w:type="dxa" w:w="3005"/>
           </w:tcPr>
           <w:p>
+            <w:pPr>
+              <w:ind w:firstLine="0"/>
+            </w:pPr>
             <w:r/>
             <w:r>
               <w:rPr>
-                <w:rFonts w:ascii="Times New Roman" w:hAnsi="Times New Roman"/>
+                <w:rFonts w:ascii="Times New Roman" w:hAnsi="Times New Roman" w:eastAsia="Times New Roman" w:cs="Times New Roman"/>
+                <w:b w:val="0"/>
+                <w:i w:val="0"/>
+                <w:color w:val="000000"/>
                 <w:sz w:val="24"/>
               </w:rPr>
-              <w:t>формирование потока заявок (запросов на обслуживание)</w:t>
+              <w:t>поток заявок</w:t>
             </w:r>
           </w:p>
         </w:tc>
@@ -856,13 +1141,19 @@
             <w:tcW w:type="dxa" w:w="2835"/>
           </w:tcPr>
           <w:p>
+            <w:pPr>
+              <w:ind w:firstLine="0"/>
+            </w:pPr>
             <w:r/>
             <w:r>
               <w:rPr>
-                <w:rFonts w:ascii="Times New Roman" w:hAnsi="Times New Roman"/>
+                <w:rFonts w:ascii="Times New Roman" w:hAnsi="Times New Roman" w:eastAsia="Times New Roman" w:cs="Times New Roman"/>
+                <w:b w:val="0"/>
+                <w:i w:val="0"/>
+                <w:color w:val="000000"/>
                 <w:sz w:val="24"/>
               </w:rPr>
-              <w:t>Period = 2; статистики: Number of entities departed (#d), Average intergeneration time</w:t>
+              <w:t>Period = 2; #d, Average intergeneration time</w:t>
             </w:r>
           </w:p>
         </w:tc>
@@ -870,13 +1161,19 @@
       <w:tr>
         <w:tc>
           <w:tcPr>
-            <w:tcW w:type="dxa" w:w="2835"/>
+            <w:tcW w:type="dxa" w:w="2948"/>
           </w:tcPr>
           <w:p>
+            <w:pPr>
+              <w:ind w:firstLine="0"/>
+            </w:pPr>
             <w:r/>
             <w:r>
               <w:rPr>
-                <w:rFonts w:ascii="Times New Roman" w:hAnsi="Times New Roman"/>
+                <w:rFonts w:ascii="Times New Roman" w:hAnsi="Times New Roman" w:eastAsia="Times New Roman" w:cs="Times New Roman"/>
+                <w:b w:val="0"/>
+                <w:i w:val="0"/>
+                <w:color w:val="000000"/>
                 <w:sz w:val="24"/>
               </w:rPr>
               <w:t>FIFO Queue</w:t>
@@ -885,16 +1182,22 @@
         </w:tc>
         <w:tc>
           <w:tcPr>
-            <w:tcW w:type="dxa" w:w="3118"/>
+            <w:tcW w:type="dxa" w:w="3005"/>
           </w:tcPr>
           <w:p>
+            <w:pPr>
+              <w:ind w:firstLine="0"/>
+            </w:pPr>
             <w:r/>
             <w:r>
               <w:rPr>
-                <w:rFonts w:ascii="Times New Roman" w:hAnsi="Times New Roman"/>
+                <w:rFonts w:ascii="Times New Roman" w:hAnsi="Times New Roman" w:eastAsia="Times New Roman" w:cs="Times New Roman"/>
+                <w:b w:val="0"/>
+                <w:i w:val="0"/>
+                <w:color w:val="000000"/>
                 <w:sz w:val="24"/>
               </w:rPr>
-              <w:t>очередь с дисциплиной FIFO</w:t>
+              <w:t>очередь FIFO</w:t>
             </w:r>
           </w:p>
         </w:tc>
@@ -903,13 +1206,19 @@
             <w:tcW w:type="dxa" w:w="2835"/>
           </w:tcPr>
           <w:p>
+            <w:pPr>
+              <w:ind w:firstLine="0"/>
+            </w:pPr>
             <w:r/>
             <w:r>
               <w:rPr>
-                <w:rFonts w:ascii="Times New Roman" w:hAnsi="Times New Roman"/>
+                <w:rFonts w:ascii="Times New Roman" w:hAnsi="Times New Roman" w:eastAsia="Times New Roman" w:cs="Times New Roman"/>
+                <w:b w:val="0"/>
+                <w:i w:val="0"/>
+                <w:color w:val="000000"/>
                 <w:sz w:val="24"/>
               </w:rPr>
-              <w:t>Capacity = 25; статистика: Average wait (среднее время ожидания)</w:t>
+              <w:t>Capacity = 25; Average wait</w:t>
             </w:r>
           </w:p>
         </w:tc>
@@ -917,13 +1226,19 @@
       <w:tr>
         <w:tc>
           <w:tcPr>
-            <w:tcW w:type="dxa" w:w="2835"/>
+            <w:tcW w:type="dxa" w:w="2948"/>
           </w:tcPr>
           <w:p>
+            <w:pPr>
+              <w:ind w:firstLine="0"/>
+            </w:pPr>
             <w:r/>
             <w:r>
               <w:rPr>
-                <w:rFonts w:ascii="Times New Roman" w:hAnsi="Times New Roman"/>
+                <w:rFonts w:ascii="Times New Roman" w:hAnsi="Times New Roman" w:eastAsia="Times New Roman" w:cs="Times New Roman"/>
+                <w:b w:val="0"/>
+                <w:i w:val="0"/>
+                <w:color w:val="000000"/>
                 <w:sz w:val="24"/>
               </w:rPr>
               <w:t>Event-Based Random Number</w:t>
@@ -932,16 +1247,22 @@
         </w:tc>
         <w:tc>
           <w:tcPr>
-            <w:tcW w:type="dxa" w:w="3118"/>
+            <w:tcW w:type="dxa" w:w="3005"/>
           </w:tcPr>
           <w:p>
+            <w:pPr>
+              <w:ind w:firstLine="0"/>
+            </w:pPr>
             <w:r/>
             <w:r>
               <w:rPr>
-                <w:rFonts w:ascii="Times New Roman" w:hAnsi="Times New Roman"/>
+                <w:rFonts w:ascii="Times New Roman" w:hAnsi="Times New Roman" w:eastAsia="Times New Roman" w:cs="Times New Roman"/>
+                <w:b w:val="0"/>
+                <w:i w:val="0"/>
+                <w:color w:val="000000"/>
                 <w:sz w:val="24"/>
               </w:rPr>
-              <w:t>генерация времени обслуживания заявок</w:t>
+              <w:t>время обслуживания</w:t>
             </w:r>
           </w:p>
         </w:tc>
@@ -950,13 +1271,19 @@
             <w:tcW w:type="dxa" w:w="2835"/>
           </w:tcPr>
           <w:p>
+            <w:pPr>
+              <w:ind w:firstLine="0"/>
+            </w:pPr>
             <w:r/>
             <w:r>
               <w:rPr>
-                <w:rFonts w:ascii="Times New Roman" w:hAnsi="Times New Roman"/>
+                <w:rFonts w:ascii="Times New Roman" w:hAnsi="Times New Roman" w:eastAsia="Times New Roman" w:cs="Times New Roman"/>
+                <w:b w:val="0"/>
+                <w:i w:val="0"/>
+                <w:color w:val="000000"/>
                 <w:sz w:val="24"/>
               </w:rPr>
-              <w:t>Distribution = Uniform; Minimum = 1,5; Maximum = 2,5</w:t>
+              <w:t>Uniform, Min = 1,5, Max = 2,5</w:t>
             </w:r>
           </w:p>
         </w:tc>
@@ -964,13 +1291,19 @@
       <w:tr>
         <w:tc>
           <w:tcPr>
-            <w:tcW w:type="dxa" w:w="2835"/>
+            <w:tcW w:type="dxa" w:w="2948"/>
           </w:tcPr>
           <w:p>
+            <w:pPr>
+              <w:ind w:firstLine="0"/>
+            </w:pPr>
             <w:r/>
             <w:r>
               <w:rPr>
-                <w:rFonts w:ascii="Times New Roman" w:hAnsi="Times New Roman"/>
+                <w:rFonts w:ascii="Times New Roman" w:hAnsi="Times New Roman" w:eastAsia="Times New Roman" w:cs="Times New Roman"/>
+                <w:b w:val="0"/>
+                <w:i w:val="0"/>
+                <w:color w:val="000000"/>
                 <w:sz w:val="24"/>
               </w:rPr>
               <w:t>Single Server</w:t>
@@ -979,13 +1312,19 @@
         </w:tc>
         <w:tc>
           <w:tcPr>
-            <w:tcW w:type="dxa" w:w="3118"/>
+            <w:tcW w:type="dxa" w:w="3005"/>
           </w:tcPr>
           <w:p>
+            <w:pPr>
+              <w:ind w:firstLine="0"/>
+            </w:pPr>
             <w:r/>
             <w:r>
               <w:rPr>
-                <w:rFonts w:ascii="Times New Roman" w:hAnsi="Times New Roman"/>
+                <w:rFonts w:ascii="Times New Roman" w:hAnsi="Times New Roman" w:eastAsia="Times New Roman" w:cs="Times New Roman"/>
+                <w:b w:val="0"/>
+                <w:i w:val="0"/>
+                <w:color w:val="000000"/>
                 <w:sz w:val="24"/>
               </w:rPr>
               <w:t>обслуживающий прибор</w:t>
@@ -997,13 +1336,19 @@
             <w:tcW w:type="dxa" w:w="2835"/>
           </w:tcPr>
           <w:p>
+            <w:pPr>
+              <w:ind w:firstLine="0"/>
+            </w:pPr>
             <w:r/>
             <w:r>
               <w:rPr>
-                <w:rFonts w:ascii="Times New Roman" w:hAnsi="Times New Roman"/>
+                <w:rFonts w:ascii="Times New Roman" w:hAnsi="Times New Roman" w:eastAsia="Times New Roman" w:cs="Times New Roman"/>
+                <w:b w:val="0"/>
+                <w:i w:val="0"/>
+                <w:color w:val="000000"/>
                 <w:sz w:val="24"/>
               </w:rPr>
-              <w:t>Service time from = Signal port t; статистика: Utilization (util)</w:t>
+              <w:t>Service time from = Signal port t; Utilization</w:t>
             </w:r>
           </w:p>
         </w:tc>
@@ -1011,13 +1356,19 @@
       <w:tr>
         <w:tc>
           <w:tcPr>
-            <w:tcW w:type="dxa" w:w="2835"/>
+            <w:tcW w:type="dxa" w:w="2948"/>
           </w:tcPr>
           <w:p>
+            <w:pPr>
+              <w:ind w:firstLine="0"/>
+            </w:pPr>
             <w:r/>
             <w:r>
               <w:rPr>
-                <w:rFonts w:ascii="Times New Roman" w:hAnsi="Times New Roman"/>
+                <w:rFonts w:ascii="Times New Roman" w:hAnsi="Times New Roman" w:eastAsia="Times New Roman" w:cs="Times New Roman"/>
+                <w:b w:val="0"/>
+                <w:i w:val="0"/>
+                <w:color w:val="000000"/>
                 <w:sz w:val="24"/>
               </w:rPr>
               <w:t>Entity Sink</w:t>
@@ -1026,13 +1377,19 @@
         </w:tc>
         <w:tc>
           <w:tcPr>
-            <w:tcW w:type="dxa" w:w="3118"/>
+            <w:tcW w:type="dxa" w:w="3005"/>
           </w:tcPr>
           <w:p>
+            <w:pPr>
+              <w:ind w:firstLine="0"/>
+            </w:pPr>
             <w:r/>
             <w:r>
               <w:rPr>
-                <w:rFonts w:ascii="Times New Roman" w:hAnsi="Times New Roman"/>
+                <w:rFonts w:ascii="Times New Roman" w:hAnsi="Times New Roman" w:eastAsia="Times New Roman" w:cs="Times New Roman"/>
+                <w:b w:val="0"/>
+                <w:i w:val="0"/>
+                <w:color w:val="000000"/>
                 <w:sz w:val="24"/>
               </w:rPr>
               <w:t>приёмник обслуженных заявок</w:t>
@@ -1044,10 +1401,16 @@
             <w:tcW w:type="dxa" w:w="2835"/>
           </w:tcPr>
           <w:p>
+            <w:pPr>
+              <w:ind w:firstLine="0"/>
+            </w:pPr>
             <w:r/>
             <w:r>
               <w:rPr>
-                <w:rFonts w:ascii="Times New Roman" w:hAnsi="Times New Roman"/>
+                <w:rFonts w:ascii="Times New Roman" w:hAnsi="Times New Roman" w:eastAsia="Times New Roman" w:cs="Times New Roman"/>
+                <w:b w:val="0"/>
+                <w:i w:val="0"/>
+                <w:color w:val="000000"/>
                 <w:sz w:val="24"/>
               </w:rPr>
               <w:t>—</w:t>
@@ -1058,13 +1421,19 @@
       <w:tr>
         <w:tc>
           <w:tcPr>
-            <w:tcW w:type="dxa" w:w="2835"/>
+            <w:tcW w:type="dxa" w:w="2948"/>
           </w:tcPr>
           <w:p>
+            <w:pPr>
+              <w:ind w:firstLine="0"/>
+            </w:pPr>
             <w:r/>
             <w:r>
               <w:rPr>
-                <w:rFonts w:ascii="Times New Roman" w:hAnsi="Times New Roman"/>
+                <w:rFonts w:ascii="Times New Roman" w:hAnsi="Times New Roman" w:eastAsia="Times New Roman" w:cs="Times New Roman"/>
+                <w:b w:val="0"/>
+                <w:i w:val="0"/>
+                <w:color w:val="000000"/>
                 <w:sz w:val="24"/>
               </w:rPr>
               <w:t>Signal Scope × 4</w:t>
@@ -1073,16 +1442,22 @@
         </w:tc>
         <w:tc>
           <w:tcPr>
-            <w:tcW w:type="dxa" w:w="3118"/>
+            <w:tcW w:type="dxa" w:w="3005"/>
           </w:tcPr>
           <w:p>
+            <w:pPr>
+              <w:ind w:firstLine="0"/>
+            </w:pPr>
             <w:r/>
             <w:r>
               <w:rPr>
-                <w:rFonts w:ascii="Times New Roman" w:hAnsi="Times New Roman"/>
+                <w:rFonts w:ascii="Times New Roman" w:hAnsi="Times New Roman" w:eastAsia="Times New Roman" w:cs="Times New Roman"/>
+                <w:b w:val="0"/>
+                <w:i w:val="0"/>
+                <w:color w:val="000000"/>
                 <w:sz w:val="24"/>
               </w:rPr>
-              <w:t>визуализация: InterTime, Service Time, Wait Time, Utilization</w:t>
+              <w:t>InterTime, Service Time, Wait Time, Utilization</w:t>
             </w:r>
           </w:p>
         </w:tc>
@@ -1091,10 +1466,16 @@
             <w:tcW w:type="dxa" w:w="2835"/>
           </w:tcPr>
           <w:p>
+            <w:pPr>
+              <w:ind w:firstLine="0"/>
+            </w:pPr>
             <w:r/>
             <w:r>
               <w:rPr>
-                <w:rFonts w:ascii="Times New Roman" w:hAnsi="Times New Roman"/>
+                <w:rFonts w:ascii="Times New Roman" w:hAnsi="Times New Roman" w:eastAsia="Times New Roman" w:cs="Times New Roman"/>
+                <w:b w:val="0"/>
+                <w:i w:val="0"/>
+                <w:color w:val="000000"/>
                 <w:sz w:val="24"/>
               </w:rPr>
               <w:t>—</w:t>
@@ -1105,13 +1486,19 @@
       <w:tr>
         <w:tc>
           <w:tcPr>
-            <w:tcW w:type="dxa" w:w="2835"/>
+            <w:tcW w:type="dxa" w:w="2948"/>
           </w:tcPr>
           <w:p>
+            <w:pPr>
+              <w:ind w:firstLine="0"/>
+            </w:pPr>
             <w:r/>
             <w:r>
               <w:rPr>
-                <w:rFonts w:ascii="Times New Roman" w:hAnsi="Times New Roman"/>
+                <w:rFonts w:ascii="Times New Roman" w:hAnsi="Times New Roman" w:eastAsia="Times New Roman" w:cs="Times New Roman"/>
+                <w:b w:val="0"/>
+                <w:i w:val="0"/>
+                <w:color w:val="000000"/>
                 <w:sz w:val="24"/>
               </w:rPr>
               <w:t>Display</w:t>
@@ -1120,16 +1507,22 @@
         </w:tc>
         <w:tc>
           <w:tcPr>
-            <w:tcW w:type="dxa" w:w="3118"/>
+            <w:tcW w:type="dxa" w:w="3005"/>
           </w:tcPr>
           <w:p>
+            <w:pPr>
+              <w:ind w:firstLine="0"/>
+            </w:pPr>
             <w:r/>
             <w:r>
               <w:rPr>
-                <w:rFonts w:ascii="Times New Roman" w:hAnsi="Times New Roman"/>
+                <w:rFonts w:ascii="Times New Roman" w:hAnsi="Times New Roman" w:eastAsia="Times New Roman" w:cs="Times New Roman"/>
+                <w:b w:val="0"/>
+                <w:i w:val="0"/>
+                <w:color w:val="000000"/>
                 <w:sz w:val="24"/>
               </w:rPr>
-              <w:t>отображение числа сформированных заявок</w:t>
+              <w:t>счётчик заявок</w:t>
             </w:r>
           </w:p>
         </w:tc>
@@ -1138,10 +1531,16 @@
             <w:tcW w:type="dxa" w:w="2835"/>
           </w:tcPr>
           <w:p>
+            <w:pPr>
+              <w:ind w:firstLine="0"/>
+            </w:pPr>
             <w:r/>
             <w:r>
               <w:rPr>
-                <w:rFonts w:ascii="Times New Roman" w:hAnsi="Times New Roman"/>
+                <w:rFonts w:ascii="Times New Roman" w:hAnsi="Times New Roman" w:eastAsia="Times New Roman" w:cs="Times New Roman"/>
+                <w:b w:val="0"/>
+                <w:i w:val="0"/>
+                <w:color w:val="000000"/>
                 <w:sz w:val="24"/>
               </w:rPr>
               <w:t>—</w:t>
@@ -1151,39 +1550,44 @@
       </w:tr>
     </w:tbl>
     <w:p>
+      <w:pPr>
+        <w:ind w:firstLine="0"/>
+      </w:pPr>
       <w:r>
         <w:rPr>
+          <w:rFonts w:ascii="Times New Roman" w:hAnsi="Times New Roman" w:eastAsia="Times New Roman" w:cs="Times New Roman"/>
           <w:b w:val="0"/>
           <w:i w:val="0"/>
+          <w:color w:val="000000"/>
+          <w:sz w:val="12"/>
         </w:rPr>
-        <w:t>Структура соединений: Time-Based Entity Generator → FIFO Queue → Single Server → Entity Sink; выход Event-Based Random Number подключён к порту t (Signal port t) сервера; сигналы статистики подключены к блокам Signal Scope и Display.</w:t>
       </w:r>
     </w:p>
     <w:p>
       <w:pPr>
-        <w:pStyle w:val="Heading1"/>
+        <w:ind w:firstLine="709"/>
       </w:pPr>
       <w:r>
-        <w:t>6. Проведение эксперимента и результаты</w:t>
-      </w:r>
-    </w:p>
-    <w:p>
-      <w:r>
         <w:rPr>
+          <w:rFonts w:ascii="Times New Roman" w:hAnsi="Times New Roman" w:eastAsia="Times New Roman" w:cs="Times New Roman"/>
           <w:b w:val="0"/>
           <w:i w:val="0"/>
+          <w:color w:val="000000"/>
+          <w:sz w:val="28"/>
         </w:rPr>
-        <w:t>В меню окна модели установлено время моделирования (Stop time) = 50, после чего нажата кнопка Start. По завершении моделирования блоки Signal Scope открыли окна с графиками (рис. 1).</w:t>
+        <w:t>Цепочка: генератор → FIFO Queue → Single Server → Entity Sink. Выход генератора случайных чисел заведён на порт t сервера. Сигналы статистики подключены к Signal Scope и Display.</w:t>
       </w:r>
     </w:p>
     <w:p>
       <w:pPr>
+        <w:spacing w:after="40"/>
+        <w:ind w:firstLine="0"/>
         <w:jc w:val="center"/>
       </w:pPr>
       <w:r>
         <w:drawing>
           <wp:inline xmlns:a="http://schemas.openxmlformats.org/drawingml/2006/main" xmlns:pic="http://schemas.openxmlformats.org/drawingml/2006/picture">
-            <wp:extent cx="5580000" cy="3138750"/>
+            <wp:extent cx="5220000" cy="3355714"/>
             <wp:docPr id="1" name="Picture 1"/>
             <wp:cNvGraphicFramePr>
               <a:graphicFrameLocks noChangeAspect="1"/>
@@ -1192,7 +1596,7 @@
               <a:graphicData uri="http://schemas.openxmlformats.org/drawingml/2006/picture">
                 <pic:pic>
                   <pic:nvPicPr>
-                    <pic:cNvPr id="0" name="lab1 primer.png"/>
+                    <pic:cNvPr id="0" name="p1_i9.png"/>
                     <pic:cNvPicPr/>
                   </pic:nvPicPr>
                   <pic:blipFill>
@@ -1204,7 +1608,7 @@
                   <pic:spPr>
                     <a:xfrm>
                       <a:off x="0" y="0"/>
-                      <a:ext cx="5580000" cy="3138750"/>
+                      <a:ext cx="5220000" cy="3355714"/>
                     </a:xfrm>
                     <a:prstGeom prst="rect"/>
                   </pic:spPr>
@@ -1217,69 +1621,182 @@
     </w:p>
     <w:p>
       <w:pPr>
+        <w:spacing w:after="200"/>
+        <w:ind w:firstLine="0"/>
         <w:jc w:val="center"/>
       </w:pPr>
       <w:r>
         <w:rPr>
+          <w:rFonts w:ascii="Times New Roman" w:hAnsi="Times New Roman" w:eastAsia="Times New Roman" w:cs="Times New Roman"/>
           <w:b w:val="0"/>
           <w:i/>
+          <w:color w:val="000000"/>
           <w:sz w:val="24"/>
         </w:rPr>
-        <w:t>Рис. 1. Результаты прогона модели: окна InterTime, Service Time, Utilization, Wait Time (и схема модели)</w:t>
-      </w:r>
-    </w:p>
-    <w:p>
-      <w:r>
-        <w:rPr>
-          <w:b w:val="0"/>
-          <w:i w:val="0"/>
-        </w:rPr>
-        <w:t>Анализ полученных графиков:</w:t>
-      </w:r>
-    </w:p>
-    <w:p>
-      <w:pPr>
-        <w:pStyle w:val="ListBullet"/>
-      </w:pPr>
-      <w:r>
-        <w:t>InterTime — точки лежат на постоянном уровне 2 с: интервал между заявками строго детерминированный, что подтверждает корректность настройки генератора (Period = 2);</w:t>
-      </w:r>
-    </w:p>
-    <w:p>
-      <w:pPr>
-        <w:pStyle w:val="ListBullet"/>
-      </w:pPr>
-      <w:r>
-        <w:t>Service Time — последовательность псевдослучайных чисел в диапазоне ≈ 1,5…2,5 с (равномерное распределение, среднее ≈ 2 с) — каждое значение используется как время обслуживания очередной заявки;</w:t>
-      </w:r>
-    </w:p>
-    <w:p>
-      <w:pPr>
-        <w:pStyle w:val="ListBullet"/>
-      </w:pPr>
-      <w:r>
-        <w:t>Wait Time — время ожидания заявок в очереди близко к нулю (единичные всплески до ≈ 0,5 с): при поступлении заявок каждые 2 с и среднем времени обслуживания 2 с очередь почти не накапливается, задержки возникают только когда время обслуживания превышает 2 с;</w:t>
-      </w:r>
-    </w:p>
-    <w:p>
-      <w:pPr>
-        <w:pStyle w:val="ListBullet"/>
-      </w:pPr>
-      <w:r>
-        <w:t>Utilization — загрузка сервера по заявкам близка к 1 (≈ 0,8…1,0): сервер практически не простаивает, система работает на границе своих возможностей (ρ = 1);</w:t>
-      </w:r>
-    </w:p>
-    <w:p>
-      <w:pPr>
-        <w:pStyle w:val="ListBullet"/>
-      </w:pPr>
-      <w:r>
-        <w:t>Display — количество сформированных заявок за 50 с ≈ 25 (точное значение — на дисплейном блоке).</w:t>
+        <w:t>Рисунок 1 — Схема модели D/D/1 в Simulink</w:t>
       </w:r>
     </w:p>
     <w:p>
       <w:pPr>
         <w:pStyle w:val="Heading1"/>
+        <w:ind w:firstLine="0"/>
+      </w:pPr>
+      <w:r>
+        <w:t>6. Результаты прогона</w:t>
+      </w:r>
+    </w:p>
+    <w:p>
+      <w:pPr>
+        <w:ind w:firstLine="709"/>
+      </w:pPr>
+      <w:r>
+        <w:rPr>
+          <w:rFonts w:ascii="Times New Roman" w:hAnsi="Times New Roman" w:eastAsia="Times New Roman" w:cs="Times New Roman"/>
+          <w:b w:val="0"/>
+          <w:i w:val="0"/>
+          <w:color w:val="000000"/>
+          <w:sz w:val="28"/>
+        </w:rPr>
+        <w:t>В окне модели установлено время моделирования 50 с, выполнен запуск (Start). После окончания прогона блоки Signal Scope вывели графики.</w:t>
+      </w:r>
+    </w:p>
+    <w:p>
+      <w:pPr>
+        <w:spacing w:after="40"/>
+        <w:ind w:firstLine="0"/>
+        <w:jc w:val="center"/>
+      </w:pPr>
+      <w:r>
+        <w:drawing>
+          <wp:inline xmlns:a="http://schemas.openxmlformats.org/drawingml/2006/main" xmlns:pic="http://schemas.openxmlformats.org/drawingml/2006/picture">
+            <wp:extent cx="5688000" cy="4538909"/>
+            <wp:docPr id="2" name="Picture 2"/>
+            <wp:cNvGraphicFramePr>
+              <a:graphicFrameLocks noChangeAspect="1"/>
+            </wp:cNvGraphicFramePr>
+            <a:graphic>
+              <a:graphicData uri="http://schemas.openxmlformats.org/drawingml/2006/picture">
+                <pic:pic>
+                  <pic:nvPicPr>
+                    <pic:cNvPr id="0" name="p1_all4.png"/>
+                    <pic:cNvPicPr/>
+                  </pic:nvPicPr>
+                  <pic:blipFill>
+                    <a:blip r:embed="rId10"/>
+                    <a:stretch>
+                      <a:fillRect/>
+                    </a:stretch>
+                  </pic:blipFill>
+                  <pic:spPr>
+                    <a:xfrm>
+                      <a:off x="0" y="0"/>
+                      <a:ext cx="5688000" cy="4538909"/>
+                    </a:xfrm>
+                    <a:prstGeom prst="rect"/>
+                  </pic:spPr>
+                </pic:pic>
+              </a:graphicData>
+            </a:graphic>
+          </wp:inline>
+        </w:drawing>
+      </w:r>
+    </w:p>
+    <w:p>
+      <w:pPr>
+        <w:spacing w:after="200"/>
+        <w:ind w:firstLine="0"/>
+        <w:jc w:val="center"/>
+      </w:pPr>
+      <w:r>
+        <w:rPr>
+          <w:rFonts w:ascii="Times New Roman" w:hAnsi="Times New Roman" w:eastAsia="Times New Roman" w:cs="Times New Roman"/>
+          <w:b w:val="0"/>
+          <w:i/>
+          <w:color w:val="000000"/>
+          <w:sz w:val="24"/>
+        </w:rPr>
+        <w:t>Рисунок 2 — Результаты прогона (InterTime, Service Time, Utilization, Wait Time), T = 50 с</w:t>
+      </w:r>
+    </w:p>
+    <w:p>
+      <w:pPr>
+        <w:ind w:firstLine="709"/>
+      </w:pPr>
+      <w:r>
+        <w:rPr>
+          <w:rFonts w:ascii="Times New Roman" w:hAnsi="Times New Roman" w:eastAsia="Times New Roman" w:cs="Times New Roman"/>
+          <w:b w:val="0"/>
+          <w:i w:val="0"/>
+          <w:color w:val="000000"/>
+          <w:sz w:val="28"/>
+        </w:rPr>
+        <w:t>InterTime. Точки лежат на уровне 2 с на всём интервале 0…50 с. Генератор работает как задано: заявка приходит строго каждые 2 секунды.</w:t>
+      </w:r>
+    </w:p>
+    <w:p>
+      <w:pPr>
+        <w:ind w:firstLine="709"/>
+      </w:pPr>
+      <w:r>
+        <w:rPr>
+          <w:rFonts w:ascii="Times New Roman" w:hAnsi="Times New Roman" w:eastAsia="Times New Roman" w:cs="Times New Roman"/>
+          <w:b w:val="0"/>
+          <w:i w:val="0"/>
+          <w:color w:val="000000"/>
+          <w:sz w:val="28"/>
+        </w:rPr>
+        <w:t>Service Time. Времена обслуживания колеблются примерно от 1,5 до 2,5 с, среднее около 2 с. Это соответствует равномерному закону, заданному в Event-Based Random Number.</w:t>
+      </w:r>
+    </w:p>
+    <w:p>
+      <w:pPr>
+        <w:ind w:firstLine="709"/>
+      </w:pPr>
+      <w:r>
+        <w:rPr>
+          <w:rFonts w:ascii="Times New Roman" w:hAnsi="Times New Roman" w:eastAsia="Times New Roman" w:cs="Times New Roman"/>
+          <w:b w:val="0"/>
+          <w:i w:val="0"/>
+          <w:color w:val="000000"/>
+          <w:sz w:val="28"/>
+        </w:rPr>
+        <w:t>Wait Time. Время ожидания близко к нулю (отдельные значения до ~0,3…0,5 с). При поступлении каждые 2 с и среднем обслуживании 2 с очередь почти не накапливается: задержка появляется только в те моменты, когда очередное обслуживание вышло за 2 с.</w:t>
+      </w:r>
+    </w:p>
+    <w:p>
+      <w:pPr>
+        <w:ind w:firstLine="709"/>
+      </w:pPr>
+      <w:r>
+        <w:rPr>
+          <w:rFonts w:ascii="Times New Roman" w:hAnsi="Times New Roman" w:eastAsia="Times New Roman" w:cs="Times New Roman"/>
+          <w:b w:val="0"/>
+          <w:i w:val="0"/>
+          <w:color w:val="000000"/>
+          <w:sz w:val="28"/>
+        </w:rPr>
+        <w:t>Utilization. Загрузка сервера держится около 1. Сервер практически не простаивает, система сидит на границе устойчивости (ρ = 1).</w:t>
+      </w:r>
+    </w:p>
+    <w:p>
+      <w:pPr>
+        <w:ind w:firstLine="709"/>
+      </w:pPr>
+      <w:r>
+        <w:rPr>
+          <w:rFonts w:ascii="Times New Roman" w:hAnsi="Times New Roman" w:eastAsia="Times New Roman" w:cs="Times New Roman"/>
+          <w:b w:val="0"/>
+          <w:i w:val="0"/>
+          <w:color w:val="000000"/>
+          <w:sz w:val="28"/>
+        </w:rPr>
+        <w:t>За 50 с сформировано 25 заявок (50 / 2 = 25), что совпадает со счётчиком Display.</w:t>
+      </w:r>
+    </w:p>
+    <w:p>
+      <w:pPr>
+        <w:pStyle w:val="Heading1"/>
+        <w:ind w:firstLine="0"/>
       </w:pPr>
       <w:r>
         <w:t>7. Выводы</w:t>
@@ -1287,44 +1804,32 @@
     </w:p>
     <w:p>
       <w:pPr>
-        <w:pStyle w:val="ListBullet"/>
+        <w:ind w:firstLine="709"/>
       </w:pPr>
       <w:r>
-        <w:t>модель СМО D/D/1 в среде Simulink (SimEvents) построена и работоспособна: поток заявок, очередь, сервер и приёмник соединены в единую Q-схему;</w:t>
+        <w:rPr>
+          <w:rFonts w:ascii="Times New Roman" w:hAnsi="Times New Roman" w:eastAsia="Times New Roman" w:cs="Times New Roman"/>
+          <w:b w:val="0"/>
+          <w:i w:val="0"/>
+          <w:color w:val="000000"/>
+          <w:sz w:val="28"/>
+        </w:rPr>
+        <w:t>Модель СМО D/D/1 в Simulink (SimEvents) собрана и прогнана. Получены графики интервалов поступления, времён обслуживания, ожидания в очереди и загрузки сервера.</w:t>
       </w:r>
     </w:p>
     <w:p>
       <w:pPr>
-        <w:pStyle w:val="ListBullet"/>
+        <w:ind w:firstLine="709"/>
       </w:pPr>
       <w:r>
-        <w:t>получена статистика по всем интересующим показателям: интервалы поступления, времена обслуживания, времена ожидания в очереди, загрузка сервера и число заявок;</w:t>
-      </w:r>
-    </w:p>
-    <w:p>
-      <w:pPr>
-        <w:pStyle w:val="ListBullet"/>
-      </w:pPr>
-      <w:r>
-        <w:t>эксперимент подтверждает теорию: при равенстве темпа поступления (2 с) и среднего времени обслуживания (2 с) система находится на границе устойчивости — сервер загружен почти на 100 %, а любой выброс времени обслуживания выше 2 с приводит к росту очереди;</w:t>
-      </w:r>
-    </w:p>
-    <w:p>
-      <w:pPr>
-        <w:pStyle w:val="ListBullet"/>
-      </w:pPr>
-      <w:r>
-        <w:t>для устойчивой работы реального объекта необходимо, чтобы среднее время обслуживания было меньше периода поступления заявок (E[S] &lt; 2 с) либо темп поступления снижён.</w:t>
-      </w:r>
-    </w:p>
-    <w:p>
-      <w:r>
         <w:rPr>
+          <w:rFonts w:ascii="Times New Roman" w:hAnsi="Times New Roman" w:eastAsia="Times New Roman" w:cs="Times New Roman"/>
           <w:b w:val="0"/>
           <w:i w:val="0"/>
-          <w:sz w:val="22"/>
+          <w:color w:val="000000"/>
+          <w:sz w:val="28"/>
         </w:rPr>
-        <w:t>Использованные источники: matlab.exponenta.ru/simulink/book1; e10-bmstu.ru/file/file297.pdf; model.exponenta.ru.</w:t>
+        <w:t>Эксперимент совпадает с теорией: при равенстве периода поступления (2 с) и среднего времени обслуживания (2 с) сервер загружен почти на 100 %, а любой выброс времени обслуживания выше 2 с даёт рост очереди. Для устойчивой работы реального объекта среднее время обслуживания должно быть меньше периода поступления заявок.</w:t>
       </w:r>
     </w:p>
     <w:sectPr>
@@ -1701,10 +2206,12 @@
     <w:qFormat/>
     <w:rsid w:val="00FC693F"/>
     <w:pPr>
-      <w:spacing w:after="120" w:line="276" w:lineRule="auto"/>
+      <w:spacing w:after="120" w:before="0" w:line="276" w:lineRule="auto"/>
+      <w:ind w:firstLine="709"/>
     </w:pPr>
     <w:rPr>
       <w:rFonts w:ascii="Times New Roman" w:hAnsi="Times New Roman" w:eastAsia="Times New Roman"/>
+      <w:color w:val="000000"/>
       <w:sz w:val="28"/>
     </w:rPr>
   </w:style>
@@ -1763,7 +2270,8 @@
     <w:pPr>
       <w:keepNext/>
       <w:keepLines/>
-      <w:spacing w:before="480" w:after="0"/>
+      <w:spacing w:before="240" w:after="120"/>
+      <w:ind w:firstLine="0"/>
       <w:outlineLvl w:val="0"/>
     </w:pPr>
     <w:rPr>
@@ -1787,7 +2295,8 @@
     <w:pPr>
       <w:keepNext/>
       <w:keepLines/>
-      <w:spacing w:before="200" w:after="0"/>
+      <w:spacing w:before="240" w:after="120"/>
+      <w:ind w:firstLine="0"/>
       <w:outlineLvl w:val="1"/>
     </w:pPr>
     <w:rPr>
@@ -2052,7 +2561,8 @@
       <w:pBdr>
         <w:bottom w:val="single" w:sz="8" w:space="4" w:color="4F81BD" w:themeColor="accent1"/>
       </w:pBdr>
-      <w:spacing w:after="300" w:line="240" w:lineRule="auto"/>
+      <w:spacing w:after="120" w:line="240" w:lineRule="auto" w:before="240"/>
+      <w:ind w:firstLine="0"/>
       <w:contextualSpacing/>
     </w:pPr>
     <w:rPr>

</xml_diff>